<commit_message>
Update Callum Wyndham - User Interface Programming - Project Research Workbook.docx
</commit_message>
<xml_diff>
--- a/Callum Wyndham - User Interface Programming - Project Research Workbook.docx
+++ b/Callum Wyndham - User Interface Programming - Project Research Workbook.docx
@@ -234,7 +234,37 @@
               <w:t>rd</w:t>
             </w:r>
             <w:r>
-              <w:t xml:space="preserve"> person platformer where you must make it across multiple levels collecting trophies without losing all your health in one. If you die, you restart the game.</w:t>
+              <w:t xml:space="preserve"> person platformer where </w:t>
+            </w:r>
+            <w:r>
+              <w:t>the player</w:t>
+            </w:r>
+            <w:r>
+              <w:t xml:space="preserve"> must make</w:t>
+            </w:r>
+            <w:r>
+              <w:t xml:space="preserve"> their way</w:t>
+            </w:r>
+            <w:r>
+              <w:t xml:space="preserve"> across multiple levels collecting trophies without losing all </w:t>
+            </w:r>
+            <w:r>
+              <w:t>their</w:t>
+            </w:r>
+            <w:r>
+              <w:t xml:space="preserve"> health in one. If </w:t>
+            </w:r>
+            <w:r>
+              <w:t>they</w:t>
+            </w:r>
+            <w:r>
+              <w:t xml:space="preserve"> die, </w:t>
+            </w:r>
+            <w:r>
+              <w:t>they</w:t>
+            </w:r>
+            <w:r>
+              <w:t xml:space="preserve"> restart the game.</w:t>
             </w:r>
           </w:p>
           <w:p/>
@@ -618,6 +648,11 @@
             <w:tcW w:w="9016" w:type="dxa"/>
           </w:tcPr>
           <w:p/>
+          <w:p>
+            <w:r>
+              <w:t>Usually, GUI is described within the User Interface section of game design documents, and usually each element of it is described in at least enough detail to understand what it does or why it’s there. If not, much information is given or if the designers want to give a better idea of what they want it to look like, they can draw mock-ups of what they imagine it looking like in game. Flow charts might also be used if they want to show how the element works.</w:t>
+            </w:r>
+          </w:p>
           <w:p/>
           <w:p/>
         </w:tc>
@@ -2114,6 +2149,7 @@
   <w:style w:type="character" w:default="1" w:styleId="DefaultParagraphFont">
     <w:name w:val="Default Paragraph Font"/>
     <w:uiPriority w:val="1"/>
+    <w:semiHidden/>
     <w:unhideWhenUsed/>
   </w:style>
   <w:style w:type="table" w:default="1" w:styleId="TableNormal">

</xml_diff>